<commit_message>
Remove photo/image placeholders from Hadil's seminar (no gallery photos)
Co-Authored-By: Claude Fable 5.1 <noreply@anthropic.com>
Claude-Session: https://claude.ai/code/session_011Z9C2ptByc9jQga6MDruQz
</commit_message>
<xml_diff>
--- a/deliverables/סמינריון_הדיל_מחקר_גישוש_מושלם.docx
+++ b/deliverables/סמינריון_הדיל_מחקר_גישוש_מושלם.docx
@@ -4425,7 +4425,7 @@
           <w:highlight w:val="yellow"/>
           <w:rtl/>
         </w:rPr>
-        <w:t>הערה לעורכת (למחוק לפני ההגשה): הקטעים המסומנים בצהוב הם מקומות שבהם יש להוסיף ממצאים מהחומרים שלך: תמונות, ציטוטים נוספים מהשיח בשיעור, מיומן החוקרת, מהתכתבויות ומהריאיון. ניסחתי סביבם את דברי ההסבר, כך שלאחר ההשלמה יש רק להסיר את הסימון הצהוב.</w:t>
+        <w:t xml:space="preserve">הערה לעורכת (למחוק לפני ההגשה): הקטעים המסומנים בצהוב הם מקומות שבהם יש להוסיף ממצאים מהחומרים שלך: ציטוטים נוספים מהשיח בשיעור, מיומן החוקרת, מהתכתבויות ומהריאיון. ניסחתי סביבם את דברי ההסבר, כך שלאחר ההשלמה יש רק להסיר את הסימון הצהוב.</w:t>
       </w:r>
     </w:p>
     <w:p>
@@ -4651,7 +4651,7 @@
           <w:highlight w:val="yellow"/>
           <w:rtl/>
         </w:rPr>
-        <w:t xml:space="preserve">להוסיף כאן: צילום של עמוד ספר הלימוד או דף העבודה שהשתמשת בו באותו שיעור, וציטוט נוסף מיומן החוקרת המתאר מה ניסית לעשות באותו רגע (למשל: האם ניגשת לאחמד? מה אמרת לו? מה הוא ענה?).</w:t>
+        <w:t xml:space="preserve">להוסיף כאן: ציטוט נוסף מיומן החוקרת המתאר מה ניסית לעשות באותו רגע (למשל: האם ניגשת לאחמד? מה אמרת לו? מה הוא ענה?).</w:t>
       </w:r>
     </w:p>
     <w:p>
@@ -4768,7 +4768,7 @@
           <w:highlight w:val="yellow"/>
           <w:rtl/>
         </w:rPr>
-        <w:t xml:space="preserve">להוסיף כאן: תאריך ההודעה, ואם יש, את התשובה שלך לנור ואת המשך ההתכתבות (צילום מסך או ציטוט). כמו כן ניתן להוסיף ציטוט מדברי חברה נוספת מהסדנה.</w:t>
+        <w:t xml:space="preserve">להוסיף כאן: תאריך ההודעה, ואם יש, את התשובה שלך לנור ואת המשך ההתכתבות (ציטוט). כמו כן ניתן להוסיף ציטוט מדברי חברה נוספת מהסדנה.</w:t>
       </w:r>
     </w:p>
     <w:p>
@@ -5908,27 +5908,6 @@
           <w:iCs w:val="false"/>
           <w:sz w:val="24"/>
           <w:szCs w:val="24"/>
-          <w:highlight w:val="yellow"/>
-          <w:rtl/>
-        </w:rPr>
-        <w:t xml:space="preserve">להוסיף כאן: את שלוש התמונות שהכנת (מנוע הקיטור, כורי הפחם, קו הייצור) ואת צילום דף העבודה הדיגיטלי, כל אחד עם כיתוב קצר (למשל: תמונה 1: מנוע הקיטור של ג׳יימס ואט, כפי שהוצג לתלמידים בשיתוף מסך).</w:t>
-      </w:r>
-    </w:p>
-    <w:p>
-      <w:pPr>
-        <w:bidi/>
-        <w:spacing w:after="120" w:line="360"/>
-        <w:jc w:val="both"/>
-      </w:pPr>
-      <w:r>
-        <w:rPr>
-          <w:rFonts w:ascii="David" w:cs="David" w:eastAsia="David" w:hAnsi="David"/>
-          <w:b w:val="false"/>
-          <w:bCs w:val="false"/>
-          <w:i w:val="false"/>
-          <w:iCs w:val="false"/>
-          <w:sz w:val="24"/>
-          <w:szCs w:val="24"/>
           <w:rtl/>
         </w:rPr>
         <w:t xml:space="preserve">הצבתי לעצמי שתי מטרות: לבדוק האם הסרת מחסום הטקסט משנה את אופן ההשתתפות של התלמידים שהתקשו בשיעורים הקודמים, ולבדוק כיצד אני עצמי מתפקדת כמורה כאשר אינני נשענת על ספר הלימוד. בחרתי לעקוב במיוחד אחר ארבעה תלמידים, ובהם אחמד וסאמי, שבשיעורים הקודמים נמנעו מהשתתפות, וזאת מתוך התבוננות בפעולותיי כלפיהם ולא מתוך חקירה שלהם.</w:t>
@@ -6253,7 +6232,7 @@
           <w:highlight w:val="yellow"/>
           <w:rtl/>
         </w:rPr>
-        <w:t xml:space="preserve">להוסיף כאן: תמונת העיר התעשייתית שהוצגה בחדר של סאמי, ציטוטים נוספים מתשובות התלמידים בדף העבודה הדיגיטלי (למשל שתיים או שלוש תשובות של זוגות שונים לשאלת התצפית וההסקה), וציטוט מיומן החוקרת על מה למדת מתוך התשובות האלה ואיך הן השפיעו על תפיסתך הפדגוגית.</w:t>
+        <w:t xml:space="preserve">להוסיף כאן: ציטוטים נוספים מתשובות התלמידים בדף העבודה הדיגיטלי (למשל שתיים או שלוש תשובות של זוגות שונים לשאלת התצפית וההסקה), וציטוט מיומן החוקרת על מה למדת מתוך התשובות האלה ואיך הן השפיעו על תפיסתך הפדגוגית.</w:t>
       </w:r>
     </w:p>
     <w:p>
@@ -6791,7 +6770,7 @@
           <w:highlight w:val="yellow"/>
           <w:rtl/>
         </w:rPr>
-        <w:t xml:space="preserve">להוסיף כאן: תמונה של הדגם של אחמד ותמונות של תוצרים נוספים (בעילום שם, ללא פרטים מזהים), וכן ציטוט מיומן החוקרת מאותו מפגש: מה חשבת על מה שנלמד, מה הפתיע אותך, מה היה לך קשה.</w:t>
+        <w:t xml:space="preserve">להוסיף כאן: ציטוט מיומן החוקרת מאותו מפגש: מה חשבת על מה שנלמד, מה הפתיע אותך, מה היה לך קשה.</w:t>
       </w:r>
     </w:p>
     <w:p>
@@ -7166,7 +7145,7 @@
           <w:highlight w:val="yellow"/>
           <w:rtl/>
         </w:rPr>
-        <w:t xml:space="preserve">להוסיף כאן: תמונות מהגלריה (ללא פנים של תלמידים), ציטוטים מהצגות של תלמידים נוספים ומהשאלות שחבריהם שאלו, תגובה של מורת המקצוע לאחר השיעור (במסדרון או בווטסאפ), וציטוט מיומן החוקרת על מה למדת ממפגש זה.</w:t>
+        <w:t xml:space="preserve">להוסיף כאן: ציטוטים מהצגות של תלמידים נוספים ומהשאלות שחבריהם שאלו, תגובה של מורת המקצוע לאחר השיעור (במסדרון או בווטסאפ), וציטוט מיומן החוקרת על מה למדת ממפגש זה.</w:t>
       </w:r>
     </w:p>
     <w:p>

</xml_diff>

<commit_message>
Delete general editor notes from Hadil's seminar
Co-Authored-By: Claude Fable 5.1 <noreply@anthropic.com>
Claude-Session: https://claude.ai/code/session_011Z9C2ptByc9jQga6MDruQz
</commit_message>
<xml_diff>
--- a/deliverables/סמינריון_הדיל_מחקר_גישוש_מושלם.docx
+++ b/deliverables/סמינריון_הדיל_מחקר_גישוש_מושלם.docx
@@ -378,27 +378,6 @@
     </w:p>
     <w:p>
       <w:pPr>
-        <w:bidi/>
-        <w:spacing w:after="120" w:line="360"/>
-        <w:jc w:val="both"/>
-      </w:pPr>
-      <w:r>
-        <w:rPr>
-          <w:rFonts w:ascii="David" w:cs="David" w:eastAsia="David" w:hAnsi="David"/>
-          <w:b w:val="false"/>
-          <w:bCs w:val="false"/>
-          <w:i w:val="false"/>
-          <w:iCs w:val="false"/>
-          <w:sz w:val="24"/>
-          <w:szCs w:val="24"/>
-          <w:highlight w:val="yellow"/>
-          <w:rtl/>
-        </w:rPr>
-        <w:t xml:space="preserve">הערה כללית (למחוק לפני ההגשה): זו הרכבה של כל הפרקים למסמך אחד. הסימונים הצהובים בכל פרק מציינים מקומות להשלמה. לפני ההגשה: להשלים, להסיר את הסימון, לעדכן את תוכן העניינים, ולעבור הגהה על כל המסמך.</w:t>
-      </w:r>
-    </w:p>
-    <w:p>
-      <w:pPr>
         <w:pStyle w:val="Heading1"/>
         <w:bidi/>
         <w:spacing w:after="360" w:line="360"/>
@@ -507,27 +486,6 @@
     </w:p>
     <w:p>
       <w:pPr>
-        <w:bidi/>
-        <w:spacing w:after="120" w:line="360"/>
-        <w:jc w:val="both"/>
-      </w:pPr>
-      <w:r>
-        <w:rPr>
-          <w:rFonts w:ascii="David" w:cs="David" w:eastAsia="David" w:hAnsi="David"/>
-          <w:b w:val="false"/>
-          <w:bCs w:val="false"/>
-          <w:i w:val="false"/>
-          <w:iCs w:val="false"/>
-          <w:sz w:val="24"/>
-          <w:szCs w:val="24"/>
-          <w:highlight w:val="yellow"/>
-          <w:rtl/>
-        </w:rPr>
-        <w:t xml:space="preserve">הערה לעורכת (למחוק לפני ההגשה): הפרק הורחב לפי משוב המרצה. שלושה מקורות מהגרסה הקודמת (כהן 2022, לוי 2020, אל-עתיבי 2021) הושמטו כי לא ניתן היה לאמת אותם. אם מצאת אותם בקטלוג הספרייה, אפשר להחזירם. יש לעבור גם על ההערות בצד הקובץ שהמרצה החזירה, שלא היו זמינות לי, ולאמת כל פריט ברשימה מול הספרייה.</w:t>
-      </w:r>
-    </w:p>
-    <w:p>
-      <w:pPr>
         <w:pStyle w:val="Heading1"/>
         <w:bidi/>
         <w:spacing w:after="360" w:line="360"/>
@@ -1282,27 +1240,6 @@
     <w:p>
       <w:r>
         <w:br w:type="page"/>
-      </w:r>
-    </w:p>
-    <w:p>
-      <w:pPr>
-        <w:bidi/>
-        <w:spacing w:after="120" w:line="360"/>
-        <w:jc w:val="both"/>
-      </w:pPr>
-      <w:r>
-        <w:rPr>
-          <w:rFonts w:ascii="David" w:cs="David" w:eastAsia="David" w:hAnsi="David"/>
-          <w:b w:val="false"/>
-          <w:bCs w:val="false"/>
-          <w:i w:val="false"/>
-          <w:iCs w:val="false"/>
-          <w:sz w:val="24"/>
-          <w:szCs w:val="24"/>
-          <w:highlight w:val="yellow"/>
-          <w:rtl/>
-        </w:rPr>
-        <w:t xml:space="preserve">הערה לעורכת (למחוק לפני ההגשה): הפרק נכתב מתוך תוכנית המחקר שלך והערות המרצה. המרצה ציינה שבמודל יש קובץ עם פסקאות מוכנות על מחקר איכותני, מחקר פעולה ומחקר עצמי, שמותר להשתמש בהן. מומלץ לפתוח אותו ולהחליף או להוסיף פסקאות ומראי מקום משם, ולוודא שכותרות תתי הסעיפים תואמות את ההנחיות במודל. הקטעים בצהוב דורשים השלמה או בדיקה שלך.</w:t>
       </w:r>
     </w:p>
     <w:p>
@@ -4409,27 +4346,6 @@
     </w:p>
     <w:p>
       <w:pPr>
-        <w:bidi/>
-        <w:spacing w:after="120" w:line="360"/>
-        <w:jc w:val="both"/>
-      </w:pPr>
-      <w:r>
-        <w:rPr>
-          <w:rFonts w:ascii="David" w:cs="David" w:eastAsia="David" w:hAnsi="David"/>
-          <w:b w:val="false"/>
-          <w:bCs w:val="false"/>
-          <w:i w:val="false"/>
-          <w:iCs w:val="false"/>
-          <w:sz w:val="24"/>
-          <w:szCs w:val="24"/>
-          <w:highlight w:val="yellow"/>
-          <w:rtl/>
-        </w:rPr>
-        <w:t xml:space="preserve">הערה לעורכת (למחוק לפני ההגשה): הקטעים המסומנים בצהוב הם מקומות שבהם יש להוסיף ממצאים מהחומרים שלך: ציטוטים נוספים מהשיח בשיעור, מיומן החוקרת, מהתכתבויות ומהריאיון. ניסחתי סביבם את דברי ההסבר, כך שלאחר ההשלמה יש רק להסיר את הסימון הצהוב.</w:t>
-      </w:r>
-    </w:p>
-    <w:p>
-      <w:pPr>
         <w:pStyle w:val="Heading1"/>
         <w:bidi/>
         <w:spacing w:after="360" w:before="0" w:line="360"/>
@@ -7289,27 +7205,6 @@
     <w:p>
       <w:r>
         <w:br w:type="page"/>
-      </w:r>
-    </w:p>
-    <w:p>
-      <w:pPr>
-        <w:bidi/>
-        <w:spacing w:after="120" w:line="360"/>
-        <w:jc w:val="both"/>
-      </w:pPr>
-      <w:r>
-        <w:rPr>
-          <w:rFonts w:ascii="David" w:cs="David" w:eastAsia="David" w:hAnsi="David"/>
-          <w:b w:val="false"/>
-          <w:bCs w:val="false"/>
-          <w:i w:val="false"/>
-          <w:iCs w:val="false"/>
-          <w:sz w:val="24"/>
-          <w:szCs w:val="24"/>
-          <w:highlight w:val="yellow"/>
-          <w:rtl/>
-        </w:rPr>
-        <w:t xml:space="preserve">הערה לעורכת (למחוק לפני ההגשה): הפרק בנוי מחמישה חלקים לפי מצגת "כתיבת פרק הדיון" ולפי הערות המרצה: תזכורת שאלת המחקר שולבה בתוך סיכום הממצאים ולא ככותרת נפרדת. כל חלק באורך 10 עד 18 שורות. הקטעים בצהוב דורשים השלמה או בדיקה.</w:t>
       </w:r>
     </w:p>
     <w:p>

</xml_diff>